<commit_message>
feat: iPhone 連携を実装（Y: HTTP API + Z: SSHレシピ）
新規（~/ai-auto/ + deploy/ 両方に配置）:
- server.py: Python標準ライブラリのみのミニHTTP API
  GET /health /kpi /outputs /outputs/<name> /schedule
  POST /publish /dry-run
  認証: AI_AUTO_TOKEN（未設定時は loopback のみ）
- run_server.sh: 起動/停止/LAN公開モード切替ヘルパ
- com.aiauto.server.plist: mac LaunchAgent サンプル（常駐起動用）
- iphone_shortcuts.md: ショートカットアプリ用 4本のレシピ（HTTP API）
  + a-Shell / SSH 補助レシピ
  Tailscale / ngrok / iCloud Private Relay の使い分け案内付き

deploy/SETUP_PROMPT.md:
- Phase 7（iPhone 対応）を追加（AI_AUTO_TOKEN 生成 → サーバー起動 → ショートカット設定 → SSH補助）

deploy/install.sh:
- *.sh / *.plist / *.md を一括コピー対象に拡張
- 完了メッセージに iPhone 関連の次ステップを追加

deploy/env.template:
- AI_AUTO_TOKEN / AI_AUTO_PORT を追加

引き継ぎ書 docx:
- 付録H: iPhone 連携（HTTP API + SSH）
- 付録I: 最終命令（旧付録Hから改番）

CDO/_index.md:
- iPhone対応の成果物ログを追記

動作確認: トークン認証 / loopback認証 / 全エンドポイント OK
</commit_message>
<xml_diff>
--- a/projects/2026-05-05_AI自動収益化引き継ぎ/outputs/claude_code_handover.docx
+++ b/projects/2026-05-05_AI自動収益化引き継ぎ/outputs/claude_code_handover.docx
@@ -7363,7 +7363,428 @@
           <w:rFonts w:ascii="Yu Gothic" w:hAnsi="Yu Gothic" w:eastAsia="Yu Gothic"/>
           <w:b w:val="0"/>
         </w:rPr>
-        <w:t>付録H　最終命令（要約）</w:t>
+        <w:t>付録H　iPhone 連携（HTTP API + SSH）</w:t>
+      </w:r>
+    </w:p>
+    <w:p>
+      <w:pPr>
+        <w:jc w:val="left"/>
+      </w:pPr>
+      <w:r>
+        <w:rPr>
+          <w:rFonts w:ascii="Yu Gothic" w:hAnsi="Yu Gothic" w:eastAsia="Yu Gothic"/>
+          <w:b w:val="0"/>
+          <w:sz w:val="22"/>
+        </w:rPr>
+        <w:t>外出先から iPhone でKPI確認・公開記録・DRY_RUN切替を行うための仕組み。ai-auto/server.py が Python標準ライブラリのみで動く HTTP API を提供し、iPhone ショートカットアプリから直接叩ける。SSH 経由の補助レシピも併用可。</w:t>
+      </w:r>
+    </w:p>
+    <w:tbl>
+      <w:tblPr>
+        <w:tblStyle w:val="LightGrid-Accent1"/>
+        <w:tblW w:type="auto" w:w="0"/>
+        <w:tblLook w:firstColumn="1" w:firstRow="1" w:lastColumn="0" w:lastRow="0" w:noHBand="0" w:noVBand="1" w:val="04A0"/>
+      </w:tblPr>
+      <w:tblGrid>
+        <w:gridCol w:w="4819"/>
+        <w:gridCol w:w="4819"/>
+      </w:tblGrid>
+      <w:tr>
+        <w:tc>
+          <w:tcPr>
+            <w:tcW w:type="dxa" w:w="4819"/>
+            <w:shd w:val="clear" w:color="auto" w:fill="1F4E78"/>
+            <w:vAlign w:val="center"/>
+          </w:tcPr>
+          <w:p>
+            <w:r/>
+            <w:r>
+              <w:rPr>
+                <w:rFonts w:ascii="Yu Gothic" w:hAnsi="Yu Gothic" w:eastAsia="Yu Gothic"/>
+                <w:b/>
+                <w:color w:val="FFFFFF"/>
+                <w:sz w:val="22"/>
+              </w:rPr>
+              <w:t>エンドポイント</w:t>
+            </w:r>
+          </w:p>
+        </w:tc>
+        <w:tc>
+          <w:tcPr>
+            <w:tcW w:type="dxa" w:w="4819"/>
+            <w:shd w:val="clear" w:color="auto" w:fill="1F4E78"/>
+            <w:vAlign w:val="center"/>
+          </w:tcPr>
+          <w:p>
+            <w:r/>
+            <w:r>
+              <w:rPr>
+                <w:rFonts w:ascii="Yu Gothic" w:hAnsi="Yu Gothic" w:eastAsia="Yu Gothic"/>
+                <w:b/>
+                <w:color w:val="FFFFFF"/>
+                <w:sz w:val="22"/>
+              </w:rPr>
+              <w:t>用途</w:t>
+            </w:r>
+          </w:p>
+        </w:tc>
+      </w:tr>
+      <w:tr>
+        <w:tc>
+          <w:tcPr>
+            <w:tcW w:type="dxa" w:w="4819"/>
+            <w:vAlign w:val="center"/>
+          </w:tcPr>
+          <w:p>
+            <w:r/>
+            <w:r>
+              <w:rPr>
+                <w:rFonts w:ascii="Yu Gothic" w:hAnsi="Yu Gothic" w:eastAsia="Yu Gothic"/>
+                <w:b w:val="0"/>
+                <w:sz w:val="21"/>
+              </w:rPr>
+              <w:t>GET /health</w:t>
+            </w:r>
+          </w:p>
+        </w:tc>
+        <w:tc>
+          <w:tcPr>
+            <w:tcW w:type="dxa" w:w="4819"/>
+            <w:vAlign w:val="center"/>
+          </w:tcPr>
+          <w:p>
+            <w:r/>
+            <w:r>
+              <w:rPr>
+                <w:rFonts w:ascii="Yu Gothic" w:hAnsi="Yu Gothic" w:eastAsia="Yu Gothic"/>
+                <w:b w:val="0"/>
+                <w:sz w:val="21"/>
+              </w:rPr>
+              <w:t>稼働確認・DRY_RUN状態取得</w:t>
+            </w:r>
+          </w:p>
+        </w:tc>
+      </w:tr>
+      <w:tr>
+        <w:tc>
+          <w:tcPr>
+            <w:tcW w:type="dxa" w:w="4819"/>
+            <w:vAlign w:val="center"/>
+          </w:tcPr>
+          <w:p>
+            <w:r/>
+            <w:r>
+              <w:rPr>
+                <w:rFonts w:ascii="Yu Gothic" w:hAnsi="Yu Gothic" w:eastAsia="Yu Gothic"/>
+                <w:b w:val="0"/>
+                <w:sz w:val="21"/>
+              </w:rPr>
+              <w:t>GET /kpi</w:t>
+            </w:r>
+          </w:p>
+        </w:tc>
+        <w:tc>
+          <w:tcPr>
+            <w:tcW w:type="dxa" w:w="4819"/>
+            <w:vAlign w:val="center"/>
+          </w:tcPr>
+          <w:p>
+            <w:r/>
+            <w:r>
+              <w:rPr>
+                <w:rFonts w:ascii="Yu Gothic" w:hAnsi="Yu Gothic" w:eastAsia="Yu Gothic"/>
+                <w:b w:val="0"/>
+                <w:sz w:val="21"/>
+              </w:rPr>
+              <w:t>KPI集計（kpi.py の出力）</w:t>
+            </w:r>
+          </w:p>
+        </w:tc>
+      </w:tr>
+      <w:tr>
+        <w:tc>
+          <w:tcPr>
+            <w:tcW w:type="dxa" w:w="4819"/>
+            <w:vAlign w:val="center"/>
+          </w:tcPr>
+          <w:p>
+            <w:r/>
+            <w:r>
+              <w:rPr>
+                <w:rFonts w:ascii="Yu Gothic" w:hAnsi="Yu Gothic" w:eastAsia="Yu Gothic"/>
+                <w:b w:val="0"/>
+                <w:sz w:val="21"/>
+              </w:rPr>
+              <w:t>GET /outputs</w:t>
+            </w:r>
+          </w:p>
+        </w:tc>
+        <w:tc>
+          <w:tcPr>
+            <w:tcW w:type="dxa" w:w="4819"/>
+            <w:vAlign w:val="center"/>
+          </w:tcPr>
+          <w:p>
+            <w:r/>
+            <w:r>
+              <w:rPr>
+                <w:rFonts w:ascii="Yu Gothic" w:hAnsi="Yu Gothic" w:eastAsia="Yu Gothic"/>
+                <w:b w:val="0"/>
+                <w:sz w:val="21"/>
+              </w:rPr>
+              <w:t>outputs/ 最新ファイル一覧</w:t>
+            </w:r>
+          </w:p>
+        </w:tc>
+      </w:tr>
+      <w:tr>
+        <w:tc>
+          <w:tcPr>
+            <w:tcW w:type="dxa" w:w="4819"/>
+            <w:vAlign w:val="center"/>
+          </w:tcPr>
+          <w:p>
+            <w:r/>
+            <w:r>
+              <w:rPr>
+                <w:rFonts w:ascii="Yu Gothic" w:hAnsi="Yu Gothic" w:eastAsia="Yu Gothic"/>
+                <w:b w:val="0"/>
+                <w:sz w:val="21"/>
+              </w:rPr>
+              <w:t>GET /outputs/&lt;name&gt;</w:t>
+            </w:r>
+          </w:p>
+        </w:tc>
+        <w:tc>
+          <w:tcPr>
+            <w:tcW w:type="dxa" w:w="4819"/>
+            <w:vAlign w:val="center"/>
+          </w:tcPr>
+          <w:p>
+            <w:r/>
+            <w:r>
+              <w:rPr>
+                <w:rFonts w:ascii="Yu Gothic" w:hAnsi="Yu Gothic" w:eastAsia="Yu Gothic"/>
+                <w:b w:val="0"/>
+                <w:sz w:val="21"/>
+              </w:rPr>
+              <w:t>ファイル本文取得</w:t>
+            </w:r>
+          </w:p>
+        </w:tc>
+      </w:tr>
+      <w:tr>
+        <w:tc>
+          <w:tcPr>
+            <w:tcW w:type="dxa" w:w="4819"/>
+            <w:vAlign w:val="center"/>
+          </w:tcPr>
+          <w:p>
+            <w:r/>
+            <w:r>
+              <w:rPr>
+                <w:rFonts w:ascii="Yu Gothic" w:hAnsi="Yu Gothic" w:eastAsia="Yu Gothic"/>
+                <w:b w:val="0"/>
+                <w:sz w:val="21"/>
+              </w:rPr>
+              <w:t>GET /schedule</w:t>
+            </w:r>
+          </w:p>
+        </w:tc>
+        <w:tc>
+          <w:tcPr>
+            <w:tcW w:type="dxa" w:w="4819"/>
+            <w:vAlign w:val="center"/>
+          </w:tcPr>
+          <w:p>
+            <w:r/>
+            <w:r>
+              <w:rPr>
+                <w:rFonts w:ascii="Yu Gothic" w:hAnsi="Yu Gothic" w:eastAsia="Yu Gothic"/>
+                <w:b w:val="0"/>
+                <w:sz w:val="21"/>
+              </w:rPr>
+              <w:t>当日 schedule.json</w:t>
+            </w:r>
+          </w:p>
+        </w:tc>
+      </w:tr>
+      <w:tr>
+        <w:tc>
+          <w:tcPr>
+            <w:tcW w:type="dxa" w:w="4819"/>
+            <w:vAlign w:val="center"/>
+          </w:tcPr>
+          <w:p>
+            <w:r/>
+            <w:r>
+              <w:rPr>
+                <w:rFonts w:ascii="Yu Gothic" w:hAnsi="Yu Gothic" w:eastAsia="Yu Gothic"/>
+                <w:b w:val="0"/>
+                <w:sz w:val="21"/>
+              </w:rPr>
+              <w:t>POST /publish</w:t>
+            </w:r>
+          </w:p>
+        </w:tc>
+        <w:tc>
+          <w:tcPr>
+            <w:tcW w:type="dxa" w:w="4819"/>
+            <w:vAlign w:val="center"/>
+          </w:tcPr>
+          <w:p>
+            <w:r/>
+            <w:r>
+              <w:rPr>
+                <w:rFonts w:ascii="Yu Gothic" w:hAnsi="Yu Gothic" w:eastAsia="Yu Gothic"/>
+                <w:b w:val="0"/>
+                <w:sz w:val="21"/>
+              </w:rPr>
+              <w:t>公開記録の追加</w:t>
+            </w:r>
+          </w:p>
+        </w:tc>
+      </w:tr>
+      <w:tr>
+        <w:tc>
+          <w:tcPr>
+            <w:tcW w:type="dxa" w:w="4819"/>
+            <w:vAlign w:val="center"/>
+          </w:tcPr>
+          <w:p>
+            <w:r/>
+            <w:r>
+              <w:rPr>
+                <w:rFonts w:ascii="Yu Gothic" w:hAnsi="Yu Gothic" w:eastAsia="Yu Gothic"/>
+                <w:b w:val="0"/>
+                <w:sz w:val="21"/>
+              </w:rPr>
+              <w:t>POST /dry-run</w:t>
+            </w:r>
+          </w:p>
+        </w:tc>
+        <w:tc>
+          <w:tcPr>
+            <w:tcW w:type="dxa" w:w="4819"/>
+            <w:vAlign w:val="center"/>
+          </w:tcPr>
+          <w:p>
+            <w:r/>
+            <w:r>
+              <w:rPr>
+                <w:rFonts w:ascii="Yu Gothic" w:hAnsi="Yu Gothic" w:eastAsia="Yu Gothic"/>
+                <w:b w:val="0"/>
+                <w:sz w:val="21"/>
+              </w:rPr>
+              <w:t>.env の DRY_RUN を 0/1 切替</w:t>
+            </w:r>
+          </w:p>
+        </w:tc>
+      </w:tr>
+    </w:tbl>
+    <w:p>
+      <w:pPr>
+        <w:jc w:val="left"/>
+      </w:pPr>
+      <w:r>
+        <w:rPr>
+          <w:rFonts w:ascii="Yu Gothic" w:hAnsi="Yu Gothic" w:eastAsia="Yu Gothic"/>
+          <w:b/>
+          <w:sz w:val="22"/>
+        </w:rPr>
+        <w:t>認証：環境変数 AI_AUTO_TOKEN（未設定時は loopback のみ）。</w:t>
+      </w:r>
+    </w:p>
+    <w:p>
+      <w:pPr>
+        <w:jc w:val="left"/>
+      </w:pPr>
+      <w:r>
+        <w:rPr>
+          <w:rFonts w:ascii="Yu Gothic" w:hAnsi="Yu Gothic" w:eastAsia="Yu Gothic"/>
+          <w:b w:val="0"/>
+          <w:sz w:val="22"/>
+        </w:rPr>
+        <w:t>起動：</w:t>
+      </w:r>
+    </w:p>
+    <w:p>
+      <w:pPr>
+        <w:spacing w:after="120"/>
+        <w:ind w:left="227"/>
+      </w:pPr>
+      <w:r>
+        <w:rPr>
+          <w:rFonts w:ascii="Consolas" w:hAnsi="Consolas" w:eastAsia="MS Gothic"/>
+          <w:b w:val="0"/>
+          <w:sz w:val="19"/>
+        </w:rPr>
+        <w:t>~/ai-auto/run_server.sh           # mac内のみ（127.0.0.1:8765）</w:t>
+        <w:br/>
+        <w:t>~/ai-auto/run_server.sh lan       # LAN公開（要 AI_AUTO_TOKEN）</w:t>
+        <w:br/>
+        <w:t># 常駐化: ~/Library/LaunchAgents/com.aiauto.server.plist を配置して launchctl load</w:t>
+      </w:r>
+    </w:p>
+    <w:tbl>
+      <w:tblPr>
+        <w:tblW w:type="auto" w:w="0"/>
+        <w:tblLook w:firstColumn="1" w:firstRow="1" w:lastColumn="0" w:lastRow="0" w:noHBand="0" w:noVBand="1" w:val="04A0"/>
+      </w:tblPr>
+      <w:tblGrid>
+        <w:gridCol w:w="9638"/>
+      </w:tblGrid>
+      <w:tr>
+        <w:tc>
+          <w:tcPr>
+            <w:tcW w:type="dxa" w:w="9638"/>
+            <w:shd w:val="clear" w:color="auto" w:fill="E7F3FF"/>
+          </w:tcPr>
+          <w:p>
+            <w:r/>
+            <w:r>
+              <w:rPr>
+                <w:rFonts w:ascii="Yu Gothic" w:hAnsi="Yu Gothic" w:eastAsia="Yu Gothic"/>
+                <w:b/>
+                <w:sz w:val="22"/>
+              </w:rPr>
+              <w:t xml:space="preserve">【外出先からも使う場合】 </w:t>
+            </w:r>
+            <w:r>
+              <w:rPr>
+                <w:rFonts w:ascii="Yu Gothic" w:hAnsi="Yu Gothic" w:eastAsia="Yu Gothic"/>
+                <w:b w:val="0"/>
+                <w:sz w:val="22"/>
+              </w:rPr>
+              <w:t>Tailscale（無料・推奨）で mac と iPhone を仮想LANに入れる。ngrok でも可だが一時URL。iCloud Private Relay はインバウンド不可なので使えない。</w:t>
+            </w:r>
+          </w:p>
+        </w:tc>
+      </w:tr>
+    </w:tbl>
+    <w:p>
+      <w:pPr>
+        <w:jc w:val="left"/>
+      </w:pPr>
+      <w:r>
+        <w:rPr>
+          <w:rFonts w:ascii="Yu Gothic" w:hAnsi="Yu Gothic" w:eastAsia="Yu Gothic"/>
+          <w:b/>
+          <w:sz w:val="22"/>
+        </w:rPr>
+        <w:t>詳細レシピ：~/ai-auto/iphone_shortcuts.md</w:t>
+      </w:r>
+    </w:p>
+    <w:p>
+      <w:pPr>
+        <w:pStyle w:val="Heading1"/>
+      </w:pPr>
+      <w:r>
+        <w:rPr>
+          <w:rFonts w:ascii="Yu Gothic" w:hAnsi="Yu Gothic" w:eastAsia="Yu Gothic"/>
+          <w:b w:val="0"/>
+        </w:rPr>
+        <w:t>付録I　最終命令（要約）</w:t>
       </w:r>
     </w:p>
     <w:p>

</xml_diff>

<commit_message>
feat: Phase 6/7 を1コマンド化（init_login.py / quick_start.sh）
新規 ~/ai-auto/ 用スクリプト:
- init_login.py:
    DRY_RUN=0 python3 init_login.py [x note crowdworks reddit]
    Playwright Chromium を起動して各サイトに順次遷移、Enter で次へ。
    Cookie/セッションを ~/ai-auto/.browser_profile/ に保存し、
    以降の自動投稿スクリプトはこれを再利用。
- quick_start.sh:
    bash quick_start.sh [lan|local|stop]
    AI_AUTO_TOKEN を自動生成（既存なら保持）、サーバー起動、
    iPhone ショートカット設定に必要な URL/トークン/IP を表示。
    .env が無い場合は install.sh 実行を促してエラー終了。

ドキュメント反映:
- deploy/SETUP_PROMPT.md: Phase 6 の Playwright 長文インラインを init_login.py 1行へ。
  Phase 7 の openssl + run_server.sh を quick_start.sh 1行へ統合
- 引き継ぎ書 docx 付録H に「1コマンドでセットアップ」項を追加
- CDO/_index.md に成果物ログ追記

動作確認:
- quick_start.sh local → /health → 401 → /kpi (token) → stop の一連を確認
- init_login.py は構文チェックのみ（Linux環境では Chromium 不在のため実行不可）
</commit_message>
<xml_diff>
--- a/projects/2026-05-05_AI自動収益化引き継ぎ/outputs/claude_code_handover.docx
+++ b/projects/2026-05-05_AI自動収益化引き継ぎ/outputs/claude_code_handover.docx
@@ -7777,6 +7777,43 @@
     </w:p>
     <w:p>
       <w:pPr>
+        <w:pStyle w:val="Heading2"/>
+      </w:pPr>
+      <w:r>
+        <w:rPr>
+          <w:rFonts w:ascii="Yu Gothic" w:hAnsi="Yu Gothic" w:eastAsia="Yu Gothic"/>
+          <w:b w:val="0"/>
+        </w:rPr>
+        <w:t>1コマンドでセットアップ</w:t>
+      </w:r>
+    </w:p>
+    <w:p>
+      <w:pPr>
+        <w:spacing w:after="120"/>
+        <w:ind w:left="227"/>
+      </w:pPr>
+      <w:r>
+        <w:rPr>
+          <w:rFonts w:ascii="Consolas" w:hAnsi="Consolas" w:eastAsia="MS Gothic"/>
+          <w:b w:val="0"/>
+          <w:sz w:val="19"/>
+        </w:rPr>
+        <w:t># iPhone 連携を立ち上げる（トークン生成＋サーバー起動＋IP表示まで）</w:t>
+        <w:br/>
+        <w:t>cd ~/ai-auto &amp;&amp; bash quick_start.sh           # LAN公開</w:t>
+        <w:br/>
+        <w:t>cd ~/ai-auto &amp;&amp; bash quick_start.sh local     # mac内のみ</w:t>
+        <w:br/>
+        <w:t>cd ~/ai-auto &amp;&amp; bash quick_start.sh stop      # 停止</w:t>
+        <w:br/>
+        <w:br/>
+        <w:t># 各サービスの初回手動ログイン（Cookie保存）</w:t>
+        <w:br/>
+        <w:t>cd ~/ai-auto &amp;&amp; DRY_RUN=0 python3 init_login.py</w:t>
+      </w:r>
+    </w:p>
+    <w:p>
+      <w:pPr>
         <w:pStyle w:val="Heading1"/>
       </w:pPr>
       <w:r>

</xml_diff>